<commit_message>
Integrate evidence by clinical relevance and confirm concise decision choices
</commit_message>
<xml_diff>
--- a/evidence/2026-10-25/docs/01_HCC_Alignment_and_Meeting_Decisions_v12.docx
+++ b/evidence/2026-10-25/docs/01_HCC_Alignment_and_Meeting_Decisions_v12.docx
@@ -9,7 +9,7 @@
         <w:widowControl/>
       </w:pPr>
       <w:r>
-        <w:t xml:space="preserve">HCC — Evidence, Alignment and Meeting Decisions V12</w:t>
+        <w:t xml:space="preserve">HCC — Evidence, Alignment and Meeting Decisions</w:t>
       </w:r>
     </w:p>
     <w:p>
@@ -166,7 +166,7 @@
             <w:sz w:val="20"/>
             <w:u w:val="single"/>
           </w:rPr>
-          <w:t>Corresponding V12 protocol / boundary addendum</w:t>
+          <w:t>Corresponding protocol / boundary addendum</w:t>
         </w:r>
       </w:hyperlink>
     </w:p>
@@ -3094,7 +3094,7 @@
             <w:sz w:val="20"/>
             <w:u w:val="single"/>
           </w:rPr>
-          <w:t>Corresponding V12 protocol / boundary addendum</w:t>
+          <w:t>Corresponding protocol / boundary addendum</w:t>
         </w:r>
       </w:hyperlink>
     </w:p>
@@ -7359,7 +7359,7 @@
         <w:widowControl/>
       </w:pPr>
       <w:r>
-        <w:t xml:space="preserve">Y90-to-LT: what the newly available full text changes</w:t>
+        <w:t xml:space="preserve">Y90 before transplantation</w:t>
       </w:r>
     </w:p>
     <w:p>
@@ -9471,7 +9471,7 @@
             <w:sz w:val="20"/>
             <w:u w:val="single"/>
           </w:rPr>
-          <w:t>Corresponding V12 protocol / boundary addendum</w:t>
+          <w:t>Corresponding protocol / boundary addendum</w:t>
         </w:r>
       </w:hyperlink>
     </w:p>
@@ -12720,7 +12720,7 @@
             <w:sz w:val="20"/>
             <w:u w:val="single"/>
           </w:rPr>
-          <w:t>Corresponding V12 protocol / boundary addendum</w:t>
+          <w:t>Corresponding protocol / boundary addendum</w:t>
         </w:r>
       </w:hyperlink>
     </w:p>
@@ -15866,7 +15866,7 @@
         <w:keepNext/>
       </w:pPr>
       <w:r>
-        <w:t xml:space="preserve">Full-text evidence and its limits</w:t>
+        <w:t xml:space="preserve">AFP evidence and its limits</w:t>
       </w:r>
     </w:p>
     <w:p>
@@ -19682,7 +19682,7 @@
         <w:keepNext/>
       </w:pPr>
       <w:r>
-        <w:t xml:space="preserve">V12 revision note</w:t>
+        <w:t xml:space="preserve">Revision history</w:t>
       </w:r>
     </w:p>
     <w:p>
@@ -19703,6 +19703,14 @@
       </w:pPr>
       <w:r>
         <w:t xml:space="preserve">Review scope: all pages of the 14 newly supplied main PDFs were read; separately linked supplements and every older retained reference were not reread. Existing formatting and prior material are retained. New clinical proposals remain OPEN. Live EndNote field structures and document-specific XML/RIS exports are included; native Word/EndNote CWYW execution has not been verified.</w:t>
+      </w:r>
+    </w:p>
+    <w:p>
+      <w:pPr>
+        <w:pStyle w:val="Normal"/>
+      </w:pPr>
+      <w:r>
+        <w:t>26 October 2026, 09:30 CDT. Presentation revision: removed release-specific emphasis and grouped evidence with the clinical question it informs. Website navigation is separate from patient findings; selecting a topic or opening a care plan does not establish eligibility. Clinical thresholds, negative results, uncertainty, source links, EndNote field data and OPEN decision status are retained.</w:t>
       </w:r>
     </w:p>
     <w:sectPr>

</xml_diff>